<commit_message>
Pitch: agregar Slide 9 con los links de evidencia (demo y usuario externo)
</commit_message>
<xml_diff>
--- a/PITCH/Guion De Pitch.docx
+++ b/PITCH/Guion De Pitch.docx
@@ -1,5 +1,5 @@
 
-<file path=word/document.xml><?xml version="1.0" encoding="utf-8"?>
+<file path=word\document.xml><?xml version="1.0" encoding="utf-8"?>
 <w:document xmlns:mc="http://schemas.openxmlformats.org/markup-compatibility/2006" xmlns:o="urn:schemas-microsoft-com:office:office" xmlns:r="http://schemas.openxmlformats.org/officeDocument/2006/relationships" xmlns:m="http://schemas.openxmlformats.org/officeDocument/2006/math" xmlns:v="urn:schemas-microsoft-com:vml" xmlns:wp="http://schemas.openxmlformats.org/drawingml/2006/wordprocessingDrawing" xmlns:w10="urn:schemas-microsoft-com:office:word" xmlns:w="http://schemas.openxmlformats.org/wordprocessingml/2006/main" xmlns:wne="http://schemas.microsoft.com/office/word/2006/wordml" xmlns:sl="http://schemas.openxmlformats.org/schemaLibrary/2006/main" xmlns:a="http://schemas.openxmlformats.org/drawingml/2006/main" xmlns:pic="http://schemas.openxmlformats.org/drawingml/2006/picture" xmlns:c="http://schemas.openxmlformats.org/drawingml/2006/chart" xmlns:lc="http://schemas.openxmlformats.org/drawingml/2006/lockedCanvas" xmlns:dgm="http://schemas.openxmlformats.org/drawingml/2006/diagram" xmlns:wps="http://schemas.microsoft.com/office/word/2010/wordprocessingShape" xmlns:wpg="http://schemas.microsoft.com/office/word/2010/wordprocessingGroup" xmlns:w14="http://schemas.microsoft.com/office/word/2010/wordml" xmlns:w15="http://schemas.microsoft.com/office/word/2012/wordml" xmlns:w16="http://schemas.microsoft.com/office/word/2018/wordml" xmlns:w16cex="http://schemas.microsoft.com/office/word/2018/wordml/cex" xmlns:w16cid="http://schemas.microsoft.com/office/word/2016/wordml/cid" xmlns="http://schemas.microsoft.com/office/tasks/2019/documenttasks" xmlns:cr="http://schemas.microsoft.com/office/comments/2020/reactions">
   <w:body>
     <w:p>
@@ -537,6 +537,116 @@
           <w:rtl w:val="0"/>
         </w:rPr>
         <w:t xml:space="preserve">Para empezar, no vamos a golpear las puertas de las multinacionales. Encontramos una oportunidad concreta: desde 2026 el INV exige que cada bodega declare por sí misma la trazabilidad de sus lotes para exportar.Con las bodega de Cafayate, Es ahí donde vamos a probar el modelo antes de escalar a distribuidores y marcas grandes </w:t>
+      </w:r>
+    </w:p>
+    <w:p>
+      <w:pPr>
+        <w:rPr/>
+      </w:pPr>
+      <w:r>
+        <w:rPr>
+          <w:rtl w:val="0"/>
+        </w:rPr>
+      </w:r>
+    </w:p>
+    <w:p>
+      <w:pPr>
+        <w:pStyle w:val="Heading1"/>
+        <w:rPr/>
+      </w:pPr>
+      <w:r>
+        <w:rPr>
+          <w:rtl w:val="0"/>
+        </w:rPr>
+        <w:t xml:space="preserve">Slide 9 — Evidencia</w:t>
+      </w:r>
+    </w:p>
+    <w:p>
+      <w:pPr>
+        <w:rPr/>
+      </w:pPr>
+      <w:r>
+        <w:rPr>
+          <w:b w:val="1"/>
+          <w:bCs w:val="1"/>
+          <w:rtl w:val="0"/>
+        </w:rPr>
+        <w:t xml:space="preserve">Texto en pantalla:</w:t>
+      </w:r>
+      <w:r>
+        <w:rPr>
+          <w:rtl w:val="0"/>
+        </w:rPr>
+      </w:r>
+    </w:p>
+    <w:p>
+      <w:pPr>
+        <w:rPr>
+          <w:b w:val="1"/>
+          <w:bCs w:val="1"/>
+        </w:rPr>
+      </w:pPr>
+      <w:r>
+        <w:rPr>
+          <w:rtl w:val="0"/>
+        </w:rPr>
+        <w:t xml:space="preserve">Evidencia — Demo completa y prueba con un usuario externo</w:t>
+      </w:r>
+      <w:r>
+        <w:rPr>
+          <w:rtl w:val="0"/>
+        </w:rPr>
+      </w:r>
+    </w:p>
+    <w:p>
+      <w:pPr>
+        <w:rPr/>
+      </w:pPr>
+      <w:r>
+        <w:rPr>
+          <w:b w:val="1"/>
+          <w:bCs w:val="1"/>
+          <w:rtl w:val="0"/>
+        </w:rPr>
+        <w:t xml:space="preserve">Qué decir:</w:t>
+      </w:r>
+      <w:r>
+        <w:rPr>
+          <w:rtl w:val="0"/>
+        </w:rPr>
+      </w:r>
+    </w:p>
+    <w:p>
+      <w:pPr>
+        <w:rPr/>
+      </w:pPr>
+      <w:r>
+        <w:rPr>
+          <w:rtl w:val="0"/>
+        </w:rPr>
+        <w:t xml:space="preserve">Toda la evidencia está en este Drive: el video de la demo, las transacciones en Stellar Expert y un video de un usuario externo activando su garantía por primera vez, sin ninguna ayuda nuestra.</w:t>
+      </w:r>
+    </w:p>
+    <w:p>
+      <w:pPr>
+        <w:rPr/>
+      </w:pPr>
+      <w:r>
+        <w:rPr>
+          <w:rtl w:val="0"/>
+        </w:rPr>
+        <w:t xml:space="preserve">Demo: https://drive.google.com/file/d/14hl6wBAVhIF8ywBQYaBkdIfa45feO5Da/view</w:t>
+      </w:r>
+    </w:p>
+    <w:p>
+      <w:pPr>
+        <w:rPr/>
+      </w:pPr>
+      <w:r>
+        <w:rPr>
+          <w:rtl w:val="0"/>
+        </w:rPr>
+        <w:t xml:space="preserve">Usuario externo: https://drive.google.com/file/d/13xmlp5yquYNThKe0jDym2_Xg5_3RngXA/view</w:t>
       </w:r>
     </w:p>
     <w:p>
@@ -578,11 +688,29 @@
 </w:document>
 </file>
 
-<file path=word/numbering.xml><?xml version="1.0" encoding="utf-8"?>
+<file path=word\fontTable.xml><?xml version="1.0" encoding="utf-8"?>
+<w:fonts xmlns:mc="http://schemas.openxmlformats.org/markup-compatibility/2006" xmlns:o="urn:schemas-microsoft-com:office:office" xmlns:r="http://schemas.openxmlformats.org/officeDocument/2006/relationships" xmlns:m="http://schemas.openxmlformats.org/officeDocument/2006/math" xmlns:v="urn:schemas-microsoft-com:vml" xmlns:wp="http://schemas.openxmlformats.org/drawingml/2006/wordprocessingDrawing" xmlns:w10="urn:schemas-microsoft-com:office:word" xmlns:w="http://schemas.openxmlformats.org/wordprocessingml/2006/main" xmlns:wne="http://schemas.microsoft.com/office/word/2006/wordml" xmlns:sl="http://schemas.openxmlformats.org/schemaLibrary/2006/main" xmlns:a="http://schemas.openxmlformats.org/drawingml/2006/main" xmlns:pic="http://schemas.openxmlformats.org/drawingml/2006/picture" xmlns:c="http://schemas.openxmlformats.org/drawingml/2006/chart" xmlns:lc="http://schemas.openxmlformats.org/drawingml/2006/lockedCanvas" xmlns:dgm="http://schemas.openxmlformats.org/drawingml/2006/diagram" xmlns:wps="http://schemas.microsoft.com/office/word/2010/wordprocessingShape" xmlns:wpg="http://schemas.microsoft.com/office/word/2010/wordprocessingGroup" xmlns:w14="http://schemas.microsoft.com/office/word/2010/wordml" xmlns:w15="http://schemas.microsoft.com/office/word/2012/wordml" xmlns:w16="http://schemas.microsoft.com/office/word/2018/wordml" xmlns:w16cex="http://schemas.microsoft.com/office/word/2018/wordml/cex" xmlns:w16cid="http://schemas.microsoft.com/office/word/2016/wordml/cid" xmlns="http://schemas.microsoft.com/office/tasks/2019/documenttasks" xmlns:cr="http://schemas.microsoft.com/office/comments/2020/reactions">
+  <w:font w:name="Arial"/>
+  <w:font w:name="Calibri"/>
+</w:fonts>
+</file>
+
+<file path=word\numbering.xml><?xml version="1.0" encoding="utf-8"?>
 <w:numbering xmlns:mc="http://schemas.openxmlformats.org/markup-compatibility/2006" xmlns:o="urn:schemas-microsoft-com:office:office" xmlns:r="http://schemas.openxmlformats.org/officeDocument/2006/relationships" xmlns:m="http://schemas.openxmlformats.org/officeDocument/2006/math" xmlns:v="urn:schemas-microsoft-com:vml" xmlns:wp="http://schemas.openxmlformats.org/drawingml/2006/wordprocessingDrawing" xmlns:w10="urn:schemas-microsoft-com:office:word" xmlns:w="http://schemas.openxmlformats.org/wordprocessingml/2006/main" xmlns:wne="http://schemas.microsoft.com/office/word/2006/wordml" xmlns:sl="http://schemas.openxmlformats.org/schemaLibrary/2006/main" xmlns:a="http://schemas.openxmlformats.org/drawingml/2006/main" xmlns:pic="http://schemas.openxmlformats.org/drawingml/2006/picture" xmlns:c="http://schemas.openxmlformats.org/drawingml/2006/chart" xmlns:lc="http://schemas.openxmlformats.org/drawingml/2006/lockedCanvas" xmlns:dgm="http://schemas.openxmlformats.org/drawingml/2006/diagram" xmlns:wps="http://schemas.microsoft.com/office/word/2010/wordprocessingShape" xmlns:wpg="http://schemas.microsoft.com/office/word/2010/wordprocessingGroup" xmlns:w14="http://schemas.microsoft.com/office/word/2010/wordml" xmlns:w15="http://schemas.microsoft.com/office/word/2012/wordml" xmlns:w16="http://schemas.microsoft.com/office/word/2018/wordml" xmlns:w16cex="http://schemas.microsoft.com/office/word/2018/wordml/cex" xmlns:w16cid="http://schemas.microsoft.com/office/word/2016/wordml/cid" xmlns="http://schemas.microsoft.com/office/tasks/2019/documenttasks" xmlns:cr="http://schemas.microsoft.com/office/comments/2020/reactions"/>
 </file>
 
-<file path=word/styles.xml><?xml version="1.0" encoding="utf-8"?>
+<file path=word\settings.xml><?xml version="1.0" encoding="utf-8"?>
+<w:settings xmlns:mc="http://schemas.openxmlformats.org/markup-compatibility/2006" xmlns:o="urn:schemas-microsoft-com:office:office" xmlns:r="http://schemas.openxmlformats.org/officeDocument/2006/relationships" xmlns:m="http://schemas.openxmlformats.org/officeDocument/2006/math" xmlns:v="urn:schemas-microsoft-com:vml" xmlns:wp="http://schemas.openxmlformats.org/drawingml/2006/wordprocessingDrawing" xmlns:w10="urn:schemas-microsoft-com:office:word" xmlns:w="http://schemas.openxmlformats.org/wordprocessingml/2006/main" xmlns:wne="http://schemas.microsoft.com/office/word/2006/wordml" xmlns:sl="http://schemas.openxmlformats.org/schemaLibrary/2006/main" xmlns:a="http://schemas.openxmlformats.org/drawingml/2006/main" xmlns:pic="http://schemas.openxmlformats.org/drawingml/2006/picture" xmlns:c="http://schemas.openxmlformats.org/drawingml/2006/chart" xmlns:lc="http://schemas.openxmlformats.org/drawingml/2006/lockedCanvas" xmlns:dgm="http://schemas.openxmlformats.org/drawingml/2006/diagram" xmlns:wps="http://schemas.microsoft.com/office/word/2010/wordprocessingShape" xmlns:wpg="http://schemas.microsoft.com/office/word/2010/wordprocessingGroup" xmlns:w14="http://schemas.microsoft.com/office/word/2010/wordml" xmlns:w15="http://schemas.microsoft.com/office/word/2012/wordml" xmlns:w16="http://schemas.microsoft.com/office/word/2018/wordml" xmlns:w16cex="http://schemas.microsoft.com/office/word/2018/wordml/cex" xmlns:w16cid="http://schemas.microsoft.com/office/word/2016/wordml/cid" xmlns="http://schemas.microsoft.com/office/tasks/2019/documenttasks" xmlns:cr="http://schemas.microsoft.com/office/comments/2020/reactions">
+  <w:embedTrueTypeFonts w:val="1"/>
+  <w:defaultTabStop w:val="720"/>
+  <w:compat>
+    <w:compatSetting w:val="15" w:name="compatibilityMode" w:uri="http://schemas.microsoft.com/office/word"/>
+  </w:compat>
+  <w:clrSchemeMapping w:bg1="light1" w:t1="dark1" w:bg2="light2" w:t2="dark2" w:accent1="accent1" w:accent2="accent2" w:accent3="accent3" w:accent4="accent4" w:accent5="accent5" w:accent6="accent6" w:hyperlink="hyperlink" w:followedHyperlink="followedHyperlink"/>
+</w:settings>
+</file>
+
+<file path=word\styles.xml><?xml version="1.0" encoding="utf-8"?>
 <w:styles xmlns:mc="http://schemas.openxmlformats.org/markup-compatibility/2006" xmlns:o="urn:schemas-microsoft-com:office:office" xmlns:r="http://schemas.openxmlformats.org/officeDocument/2006/relationships" xmlns:m="http://schemas.openxmlformats.org/officeDocument/2006/math" xmlns:v="urn:schemas-microsoft-com:vml" xmlns:wp="http://schemas.openxmlformats.org/drawingml/2006/wordprocessingDrawing" xmlns:w10="urn:schemas-microsoft-com:office:word" xmlns:w="http://schemas.openxmlformats.org/wordprocessingml/2006/main" xmlns:wne="http://schemas.microsoft.com/office/word/2006/wordml" xmlns:sl="http://schemas.openxmlformats.org/schemaLibrary/2006/main" xmlns:a="http://schemas.openxmlformats.org/drawingml/2006/main" xmlns:pic="http://schemas.openxmlformats.org/drawingml/2006/picture" xmlns:c="http://schemas.openxmlformats.org/drawingml/2006/chart" xmlns:lc="http://schemas.openxmlformats.org/drawingml/2006/lockedCanvas" xmlns:dgm="http://schemas.openxmlformats.org/drawingml/2006/diagram" xmlns:wps="http://schemas.microsoft.com/office/word/2010/wordprocessingShape" xmlns:wpg="http://schemas.microsoft.com/office/word/2010/wordprocessingGroup" xmlns:w14="http://schemas.microsoft.com/office/word/2010/wordml" xmlns:w15="http://schemas.microsoft.com/office/word/2012/wordml" xmlns:w16="http://schemas.microsoft.com/office/word/2018/wordml" xmlns:w16cex="http://schemas.microsoft.com/office/word/2018/wordml/cex" xmlns:w16cid="http://schemas.microsoft.com/office/word/2016/wordml/cid" xmlns="http://schemas.microsoft.com/office/tasks/2019/documenttasks" xmlns:cr="http://schemas.microsoft.com/office/comments/2020/reactions">
   <w:docDefaults>
     <w:rPrDefault>
@@ -747,7 +875,7 @@
 </w:styles>
 </file>
 
-<file path=word/theme/theme1.xml><?xml version="1.0" encoding="utf-8"?>
+<file path=word\theme\theme1.xml><?xml version="1.0" encoding="utf-8"?>
 <a:theme xmlns:a="http://schemas.openxmlformats.org/drawingml/2006/main" name="Office Theme">
   <a:themeElements>
     <a:clrScheme name="Office">

</xml_diff>

<commit_message>
Pitch: apuntar los videos de evidencia a los .md del repo en vez del link directo de Drive
</commit_message>
<xml_diff>
--- a/PITCH/Guion De Pitch.docx
+++ b/PITCH/Guion De Pitch.docx
@@ -635,18 +635,18 @@
         <w:rPr>
           <w:rtl w:val="0"/>
         </w:rPr>
-        <w:t xml:space="preserve">Demo: https://drive.google.com/file/d/14hl6wBAVhIF8ywBQYaBkdIfa45feO5Da/view</w:t>
-      </w:r>
-    </w:p>
-    <w:p>
-      <w:pPr>
-        <w:rPr/>
-      </w:pPr>
-      <w:r>
-        <w:rPr>
-          <w:rtl w:val="0"/>
-        </w:rPr>
-        <w:t xml:space="preserve">Usuario externo: https://drive.google.com/file/d/13xmlp5yquYNThKe0jDym2_Xg5_3RngXA/view</w:t>
+        <w:t xml:space="preserve">Demo: https://github.com/migux97/VeriFire/blob/main/docs/video-demo.md</w:t>
+      </w:r>
+    </w:p>
+    <w:p>
+      <w:pPr>
+        <w:rPr/>
+      </w:pPr>
+      <w:r>
+        <w:rPr>
+          <w:rtl w:val="0"/>
+        </w:rPr>
+        <w:t xml:space="preserve">Usuario externo: https://github.com/migux97/VeriFire/blob/main/docs/video-usuario-externo.md</w:t>
       </w:r>
     </w:p>
     <w:p>

</xml_diff>

<commit_message>
Mover los videos de evidencia a PITCH/ y actualizar sus enlaces
</commit_message>
<xml_diff>
--- a/PITCH/Guion De Pitch.docx
+++ b/PITCH/Guion De Pitch.docx
@@ -635,18 +635,18 @@
         <w:rPr>
           <w:rtl w:val="0"/>
         </w:rPr>
-        <w:t xml:space="preserve">Demo: https://github.com/migux97/VeriFire/blob/main/docs/video-demo.md</w:t>
-      </w:r>
-    </w:p>
-    <w:p>
-      <w:pPr>
-        <w:rPr/>
-      </w:pPr>
-      <w:r>
-        <w:rPr>
-          <w:rtl w:val="0"/>
-        </w:rPr>
-        <w:t xml:space="preserve">Usuario externo: https://github.com/migux97/VeriFire/blob/main/docs/video-usuario-externo.md</w:t>
+        <w:t xml:space="preserve">Demo: https://github.com/migux97/VeriFire/blob/main/PITCH/video-demo.md</w:t>
+      </w:r>
+    </w:p>
+    <w:p>
+      <w:pPr>
+        <w:rPr/>
+      </w:pPr>
+      <w:r>
+        <w:rPr>
+          <w:rtl w:val="0"/>
+        </w:rPr>
+        <w:t xml:space="preserve">Usuario externo: https://github.com/migux97/VeriFire/blob/main/PITCH/video-usuario-externo.md</w:t>
       </w:r>
     </w:p>
     <w:p>

</xml_diff>